<commit_message>
Add ##INSERT_EXECUTOR_EXTRA## marker to will_template.docx
Inserts marker after the Powers of Executor body paragraph so the
'Authority to Sell Real Estate' clause has a defined insertion point.
Upload this file to Google Drive to replace the current template.

Co-Authored-By: Claude Sonnet 4.6 <noreply@anthropic.com>
</commit_message>
<xml_diff>
--- a/api/templates/will_template.docx
+++ b/api/templates/will_template.docx
@@ -224,6 +224,11 @@
       <w:r>
         <w:lastRenderedPageBreak/>
         <w:t>Assembly of 1963, Tennessee Code Annotated §35-4-101 et seq. to §35-4-121, granting to my Executor full power to do all things therein provided.</w:t>
+      </w:r>
+    </w:p>
+    <w:p>
+      <w:r>
+        <w:t>##INSERT_EXECUTOR_EXTRA##</w:t>
       </w:r>
     </w:p>
     <w:p>

</xml_diff>

<commit_message>
Fix Sell Real Estate and Specific Bequests clause insertion
- Add ##INSERT_SPECIFIC_BEQUESTS## marker to will_template.docx before 'A. To My Spouse'
- Add Step 2b in generate-will.py to handle Specific Bequests insertion at correct position
- Fix Step 3b (##INSERT_EXECUTOR_EXTRA##) to use marker_elem.addprevious() and always remove marker
- Remove Specific Bequests from insert_article_iii_clauses (now handled in Step 2b)
- Add missing guardian and clause fields to requestData payload in index.html

Co-Authored-By: Claude Sonnet 4.6 <noreply@anthropic.com>
</commit_message>
<xml_diff>
--- a/api/templates/will_template.docx
+++ b/api/templates/will_template.docx
@@ -75,6 +75,11 @@
       </w:pPr>
       <w:r>
         <w:t>Article III - Disposition of Property</w:t>
+      </w:r>
+    </w:p>
+    <w:p>
+      <w:r>
+        <w:t>##INSERT_SPECIFIC_BEQUESTS##</w:t>
       </w:r>
     </w:p>
     <w:p>

</xml_diff>